<commit_message>
commit inicial: subida de la segunda version de la presentacion
</commit_message>
<xml_diff>
--- a/Actividad_1_Diego_Miranda.docx
+++ b/Actividad_1_Diego_Miranda.docx
@@ -3166,6 +3166,7 @@
           <w:rFonts w:ascii="Arial" w:hAnsi="Arial" w:cs="Arial"/>
           <w:b/>
           <w:bCs/>
+          <w:noProof/>
           <w:sz w:val="24"/>
           <w:szCs w:val="24"/>
           <w:lang w:eastAsia="es-EC"/>
@@ -3252,27 +3253,52 @@
           <w:lang w:eastAsia="es-EC"/>
         </w:rPr>
       </w:pPr>
-    </w:p>
-    <w:p>
-      <w:pPr>
-        <w:pStyle w:val="Sinespaciado"/>
-        <w:spacing w:line="360" w:lineRule="auto"/>
-        <w:jc w:val="both"/>
-        <w:rPr>
-          <w:rFonts w:ascii="Arial" w:hAnsi="Arial" w:cs="Arial"/>
+      <w:r>
+        <w:rPr>
+          <w:rFonts w:ascii="Arial" w:eastAsiaTheme="majorEastAsia" w:hAnsi="Arial" w:cs="Arial"/>
           <w:b/>
           <w:bCs/>
-          <w:lang w:eastAsia="es-EC"/>
-        </w:rPr>
-      </w:pPr>
-      <w:r>
-        <w:rPr>
-          <w:rFonts w:ascii="Arial" w:hAnsi="Arial" w:cs="Arial"/>
-          <w:b/>
-          <w:bCs/>
-          <w:lang w:eastAsia="es-EC"/>
-        </w:rPr>
-        <w:t>Bibliografía</w:t>
+          <w:noProof/>
+          <w:color w:val="2F5496" w:themeColor="accent1" w:themeShade="BF"/>
+          <w:sz w:val="24"/>
+          <w:szCs w:val="24"/>
+          <w:lang w:eastAsia="es-EC"/>
+        </w:rPr>
+        <w:drawing>
+          <wp:inline distT="0" distB="0" distL="0" distR="0" wp14:anchorId="32D25FE5" wp14:editId="47B4F51D">
+            <wp:extent cx="5400040" cy="2745105"/>
+            <wp:effectExtent l="0" t="0" r="0" b="0"/>
+            <wp:docPr id="1710260407" name="Imagen 1"/>
+            <wp:cNvGraphicFramePr>
+              <a:graphicFrameLocks xmlns:a="http://schemas.openxmlformats.org/drawingml/2006/main" noChangeAspect="1"/>
+            </wp:cNvGraphicFramePr>
+            <a:graphic xmlns:a="http://schemas.openxmlformats.org/drawingml/2006/main">
+              <a:graphicData uri="http://schemas.openxmlformats.org/drawingml/2006/picture">
+                <pic:pic xmlns:pic="http://schemas.openxmlformats.org/drawingml/2006/picture">
+                  <pic:nvPicPr>
+                    <pic:cNvPr id="1710260407" name=""/>
+                    <pic:cNvPicPr/>
+                  </pic:nvPicPr>
+                  <pic:blipFill>
+                    <a:blip r:embed="rId17"/>
+                    <a:stretch>
+                      <a:fillRect/>
+                    </a:stretch>
+                  </pic:blipFill>
+                  <pic:spPr>
+                    <a:xfrm>
+                      <a:off x="0" y="0"/>
+                      <a:ext cx="5400040" cy="2745105"/>
+                    </a:xfrm>
+                    <a:prstGeom prst="rect">
+                      <a:avLst/>
+                    </a:prstGeom>
+                  </pic:spPr>
+                </pic:pic>
+              </a:graphicData>
+            </a:graphic>
+          </wp:inline>
+        </w:drawing>
       </w:r>
     </w:p>
     <w:p>
@@ -3288,6 +3314,204 @@
         <w:spacing w:after="0" w:line="240" w:lineRule="auto"/>
         <w:jc w:val="both"/>
         <w:rPr>
+          <w:rFonts w:ascii="Arial" w:eastAsiaTheme="majorEastAsia" w:hAnsi="Arial" w:cs="Arial"/>
+          <w:b/>
+          <w:bCs/>
+          <w:color w:val="2F5496" w:themeColor="accent1" w:themeShade="BF"/>
+          <w:sz w:val="24"/>
+          <w:szCs w:val="24"/>
+          <w:lang w:eastAsia="es-EC"/>
+        </w:rPr>
+      </w:pPr>
+    </w:p>
+    <w:p>
+      <w:pPr>
+        <w:widowControl w:val="0"/>
+        <w:pBdr>
+          <w:top w:val="nil"/>
+          <w:left w:val="nil"/>
+          <w:bottom w:val="nil"/>
+          <w:right w:val="nil"/>
+          <w:between w:val="nil"/>
+        </w:pBdr>
+        <w:spacing w:after="0" w:line="240" w:lineRule="auto"/>
+        <w:jc w:val="both"/>
+        <w:rPr>
+          <w:rFonts w:ascii="Arial" w:eastAsiaTheme="majorEastAsia" w:hAnsi="Arial" w:cs="Arial"/>
+          <w:b/>
+          <w:bCs/>
+          <w:color w:val="2F5496" w:themeColor="accent1" w:themeShade="BF"/>
+          <w:sz w:val="24"/>
+          <w:szCs w:val="24"/>
+          <w:lang w:eastAsia="es-EC"/>
+        </w:rPr>
+      </w:pPr>
+      <w:hyperlink r:id="rId18" w:history="1">
+        <w:r>
+          <w:rPr>
+            <w:rStyle w:val="Hipervnculo"/>
+            <w:rFonts w:ascii="Arial" w:eastAsiaTheme="majorEastAsia" w:hAnsi="Arial" w:cs="Arial"/>
+            <w:b/>
+            <w:bCs/>
+            <w:sz w:val="24"/>
+            <w:szCs w:val="24"/>
+            <w:lang w:eastAsia="es-EC"/>
+          </w:rPr>
+          <w:t>https://github.com/dmiranda5820/tarea-patrones-uml.git</w:t>
+        </w:r>
+      </w:hyperlink>
+    </w:p>
+    <w:p>
+      <w:pPr>
+        <w:widowControl w:val="0"/>
+        <w:pBdr>
+          <w:top w:val="nil"/>
+          <w:left w:val="nil"/>
+          <w:bottom w:val="nil"/>
+          <w:right w:val="nil"/>
+          <w:between w:val="nil"/>
+        </w:pBdr>
+        <w:spacing w:after="0" w:line="240" w:lineRule="auto"/>
+        <w:jc w:val="both"/>
+        <w:rPr>
+          <w:rFonts w:ascii="Arial" w:eastAsiaTheme="majorEastAsia" w:hAnsi="Arial" w:cs="Arial"/>
+          <w:b/>
+          <w:bCs/>
+          <w:color w:val="2F5496" w:themeColor="accent1" w:themeShade="BF"/>
+          <w:sz w:val="24"/>
+          <w:szCs w:val="24"/>
+          <w:lang w:eastAsia="es-EC"/>
+        </w:rPr>
+      </w:pPr>
+    </w:p>
+    <w:p>
+      <w:pPr>
+        <w:widowControl w:val="0"/>
+        <w:pBdr>
+          <w:top w:val="nil"/>
+          <w:left w:val="nil"/>
+          <w:bottom w:val="nil"/>
+          <w:right w:val="nil"/>
+          <w:between w:val="nil"/>
+        </w:pBdr>
+        <w:spacing w:after="0" w:line="240" w:lineRule="auto"/>
+        <w:jc w:val="both"/>
+        <w:rPr>
+          <w:rFonts w:ascii="Arial" w:eastAsiaTheme="majorEastAsia" w:hAnsi="Arial" w:cs="Arial"/>
+          <w:b/>
+          <w:bCs/>
+          <w:color w:val="2F5496" w:themeColor="accent1" w:themeShade="BF"/>
+          <w:sz w:val="24"/>
+          <w:szCs w:val="24"/>
+          <w:lang w:eastAsia="es-EC"/>
+        </w:rPr>
+      </w:pPr>
+      <w:r>
+        <w:rPr>
+          <w:rFonts w:ascii="Arial" w:eastAsiaTheme="majorEastAsia" w:hAnsi="Arial" w:cs="Arial"/>
+          <w:b/>
+          <w:bCs/>
+          <w:color w:val="2F5496" w:themeColor="accent1" w:themeShade="BF"/>
+          <w:sz w:val="24"/>
+          <w:szCs w:val="24"/>
+          <w:lang w:eastAsia="es-EC"/>
+        </w:rPr>
+        <w:lastRenderedPageBreak/>
+        <w:drawing>
+          <wp:inline distT="0" distB="0" distL="0" distR="0" wp14:anchorId="1109184D" wp14:editId="621EE1A7">
+            <wp:extent cx="5400040" cy="2865120"/>
+            <wp:effectExtent l="0" t="0" r="0" b="0"/>
+            <wp:docPr id="1715659760" name="Imagen 1"/>
+            <wp:cNvGraphicFramePr>
+              <a:graphicFrameLocks xmlns:a="http://schemas.openxmlformats.org/drawingml/2006/main" noChangeAspect="1"/>
+            </wp:cNvGraphicFramePr>
+            <a:graphic xmlns:a="http://schemas.openxmlformats.org/drawingml/2006/main">
+              <a:graphicData uri="http://schemas.openxmlformats.org/drawingml/2006/picture">
+                <pic:pic xmlns:pic="http://schemas.openxmlformats.org/drawingml/2006/picture">
+                  <pic:nvPicPr>
+                    <pic:cNvPr id="1715659760" name=""/>
+                    <pic:cNvPicPr/>
+                  </pic:nvPicPr>
+                  <pic:blipFill>
+                    <a:blip r:embed="rId19"/>
+                    <a:stretch>
+                      <a:fillRect/>
+                    </a:stretch>
+                  </pic:blipFill>
+                  <pic:spPr>
+                    <a:xfrm>
+                      <a:off x="0" y="0"/>
+                      <a:ext cx="5400040" cy="2865120"/>
+                    </a:xfrm>
+                    <a:prstGeom prst="rect">
+                      <a:avLst/>
+                    </a:prstGeom>
+                  </pic:spPr>
+                </pic:pic>
+              </a:graphicData>
+            </a:graphic>
+          </wp:inline>
+        </w:drawing>
+      </w:r>
+    </w:p>
+    <w:p>
+      <w:pPr>
+        <w:widowControl w:val="0"/>
+        <w:pBdr>
+          <w:top w:val="nil"/>
+          <w:left w:val="nil"/>
+          <w:bottom w:val="nil"/>
+          <w:right w:val="nil"/>
+          <w:between w:val="nil"/>
+        </w:pBdr>
+        <w:spacing w:after="0" w:line="240" w:lineRule="auto"/>
+        <w:jc w:val="both"/>
+        <w:rPr>
+          <w:rFonts w:ascii="Arial" w:eastAsiaTheme="majorEastAsia" w:hAnsi="Arial" w:cs="Arial"/>
+          <w:b/>
+          <w:bCs/>
+          <w:color w:val="2F5496" w:themeColor="accent1" w:themeShade="BF"/>
+          <w:sz w:val="24"/>
+          <w:szCs w:val="24"/>
+          <w:lang w:eastAsia="es-EC"/>
+        </w:rPr>
+      </w:pPr>
+    </w:p>
+    <w:p>
+      <w:pPr>
+        <w:pStyle w:val="Sinespaciado"/>
+        <w:spacing w:line="360" w:lineRule="auto"/>
+        <w:jc w:val="both"/>
+        <w:rPr>
+          <w:rFonts w:ascii="Arial" w:hAnsi="Arial" w:cs="Arial"/>
+          <w:b/>
+          <w:bCs/>
+          <w:lang w:eastAsia="es-EC"/>
+        </w:rPr>
+      </w:pPr>
+      <w:r>
+        <w:rPr>
+          <w:rFonts w:ascii="Arial" w:hAnsi="Arial" w:cs="Arial"/>
+          <w:b/>
+          <w:bCs/>
+          <w:lang w:eastAsia="es-EC"/>
+        </w:rPr>
+        <w:t>Bibliografía</w:t>
+      </w:r>
+    </w:p>
+    <w:p>
+      <w:pPr>
+        <w:widowControl w:val="0"/>
+        <w:pBdr>
+          <w:top w:val="nil"/>
+          <w:left w:val="nil"/>
+          <w:bottom w:val="nil"/>
+          <w:right w:val="nil"/>
+          <w:between w:val="nil"/>
+        </w:pBdr>
+        <w:spacing w:after="0" w:line="240" w:lineRule="auto"/>
+        <w:jc w:val="both"/>
+        <w:rPr>
           <w:rFonts w:ascii="Arial" w:hAnsi="Arial" w:cs="Arial"/>
           <w:i/>
           <w:iCs/>
@@ -3305,9 +3529,21 @@
           <w:szCs w:val="20"/>
           <w:lang w:eastAsia="es-EC"/>
         </w:rPr>
-        <w:t>(</w:t>
-      </w:r>
-      <w:r>
+        <w:t>Astigarraga, J., &amp; Cruz-Alonso, V. (2022). ¡ Se puede entender cómo funcionan Git y GitHub!. ecosistemas, 31(1), 2332-2332.</w:t>
+      </w:r>
+    </w:p>
+    <w:p>
+      <w:pPr>
+        <w:widowControl w:val="0"/>
+        <w:pBdr>
+          <w:top w:val="nil"/>
+          <w:left w:val="nil"/>
+          <w:bottom w:val="nil"/>
+          <w:right w:val="nil"/>
+          <w:between w:val="nil"/>
+        </w:pBdr>
+        <w:spacing w:after="0" w:line="240" w:lineRule="auto"/>
+        <w:jc w:val="both"/>
         <w:rPr>
           <w:rFonts w:ascii="Arial" w:hAnsi="Arial" w:cs="Arial"/>
           <w:i/>
@@ -3316,8 +3552,7 @@
           <w:szCs w:val="20"/>
           <w:lang w:eastAsia="es-EC"/>
         </w:rPr>
-        <w:t>Referencias bibliográficas y/o enlaces en Internet (normas APA) que se utilizaron para realizar la práctica.</w:t>
-      </w:r>
+      </w:pPr>
       <w:r>
         <w:rPr>
           <w:rFonts w:ascii="Arial" w:hAnsi="Arial" w:cs="Arial"/>
@@ -3327,11 +3562,11 @@
           <w:szCs w:val="20"/>
           <w:lang w:eastAsia="es-EC"/>
         </w:rPr>
-        <w:t>)</w:t>
+        <w:t>Prieto, J. G. (2018). ¿ Por qué usar GitHub? Diez pasos para disfrutar de GitHub y no morir en el intento. Ecosistemas, 27(2), 140-141.</w:t>
       </w:r>
     </w:p>
     <w:sectPr>
-      <w:headerReference w:type="first" r:id="rId17"/>
+      <w:headerReference w:type="first" r:id="rId20"/>
       <w:pgSz w:w="11906" w:h="16838"/>
       <w:pgMar w:top="1417" w:right="1701" w:bottom="1417" w:left="1701" w:header="708" w:footer="708" w:gutter="0"/>
       <w:pgNumType w:start="1"/>
@@ -4203,7 +4438,7 @@
         <v:path o:extrusionok="f" gradientshapeok="t" o:connecttype="rect"/>
         <o:lock v:ext="edit" aspectratio="t"/>
       </v:shapetype>
-      <v:shape id="_x0000_i1029" type="#_x0000_t75" style="width:11.4pt;height:11.4pt" o:bullet="t">
+      <v:shape id="_x0000_i1035" type="#_x0000_t75" style="width:11.4pt;height:11.4pt" o:bullet="t">
         <v:imagedata r:id="rId1" o:title="mso3E28"/>
       </v:shape>
     </w:pict>
@@ -7238,7 +7473,6 @@
   <w:style w:type="character" w:default="1" w:styleId="Fuentedeprrafopredeter">
     <w:name w:val="Default Paragraph Font"/>
     <w:uiPriority w:val="1"/>
-    <w:semiHidden/>
     <w:unhideWhenUsed/>
   </w:style>
   <w:style w:type="table" w:default="1" w:styleId="Tablanormal">

</xml_diff>